<commit_message>
Point write-up to live Streamlit app and repo
</commit_message>
<xml_diff>
--- a/docs/Take-Home_Write-up.docx
+++ b/docs/Take-Home_Write-up.docx
@@ -50,7 +50,47 @@
           <w:sz w:val="21"/>
           <w:szCs w:val="21"/>
         </w:rPr>
-        <w:t xml:space="preserve">(1) People_Intelligence_Explorer.html, the interactive tool an HRBP would open (pick a leader, filter, click into sub-orgs, change the as-of month); (2) working_files/ with the cleaning code, metric engine, SQL cross-check, issue log and a one-command refresh; (3) this note.</w:t>
+        <w:t xml:space="preserve">(1) a live app, </w:t>
+      </w:r>
+      <w:hyperlink r:id="rIdPI1" w:history="1">
+        <w:r>
+          <w:rPr>
+            <w:rFonts w:ascii="Arial" w:cs="Arial" w:eastAsia="Arial" w:hAnsi="Arial"/>
+            <w:color w:val="0563C1"/>
+            <w:sz w:val="21"/>
+            <w:szCs w:val="21"/>
+            <w:u w:val="single"/>
+          </w:rPr>
+          <w:t>https://fanatics-people-intelligence.streamlit.app/</w:t>
+        </w:r>
+      </w:hyperlink>
+      <w:r>
+        <w:rPr>
+          <w:rFonts w:ascii="Arial" w:cs="Arial" w:eastAsia="Arial" w:hAnsi="Arial"/>
+          <w:sz w:val="21"/>
+          <w:szCs w:val="21"/>
+        </w:rPr>
+        <w:t xml:space="preserve">, the interactive tool an HRBP would open (pick a leader, filter, click into sub-orgs, change the as-of month; upload next month’s workbook to refresh it), with docs/People_Intelligence_Explorer.html in the repo as a backup that opens without any server; (2) the code on GitHub, </w:t>
+      </w:r>
+      <w:hyperlink r:id="rIdPI2" w:history="1">
+        <w:r>
+          <w:rPr>
+            <w:rFonts w:ascii="Arial" w:cs="Arial" w:eastAsia="Arial" w:hAnsi="Arial"/>
+            <w:color w:val="0563C1"/>
+            <w:sz w:val="21"/>
+            <w:szCs w:val="21"/>
+            <w:u w:val="single"/>
+          </w:rPr>
+          <w:t>https://github.com/anushreeayyar/Fanatics_People_Intelligence</w:t>
+        </w:r>
+      </w:hyperlink>
+      <w:r>
+        <w:rPr>
+          <w:rFonts w:ascii="Arial" w:cs="Arial" w:eastAsia="Arial" w:hAnsi="Arial"/>
+          <w:sz w:val="21"/>
+          <w:szCs w:val="21"/>
+        </w:rPr>
+        <w:t xml:space="preserve">, with the cleaning code, metric engine, SQL cross-check, issue log and tests; (3) this note.</w:t>
       </w:r>
     </w:p>
     <w:p>

</xml_diff>

<commit_message>
Fill in time spent in the write-up
</commit_message>
<xml_diff>
--- a/docs/Take-Home_Write-up.docx
+++ b/docs/Take-Home_Write-up.docx
@@ -1477,10 +1477,124 @@
       <w:r>
         <w:rPr>
           <w:rFonts w:ascii="Arial" w:cs="Arial" w:eastAsia="Arial" w:hAnsi="Arial"/>
-          <w:sz w:val="21"/>
-          <w:szCs w:val="21"/>
-        </w:rPr>
-        <w:t xml:space="preserve">[Fill in: roughly X hours in total; e.g. data profiling and issue-hunting, cleaning and metric logic, tool build, verification, write-up.]</w:t>
+          <w:b/>
+          <w:bCs/>
+          <w:sz w:val="21"/>
+          <w:szCs w:val="21"/>
+        </w:rPr>
+        <w:t xml:space="preserve">Approximately 2 hours 15 minutes in total, split roughly as follows.</w:t>
+      </w:r>
+    </w:p>
+    <w:p>
+      <w:pPr>
+        <w:pStyle w:val="ListParagraph"/>
+        <w:numPr>
+          <w:ilvl w:val="0"/>
+          <w:numId w:val="2"/>
+        </w:numPr>
+        <w:spacing w:after="60"/>
+      </w:pPr>
+      <w:r>
+        <w:rPr>
+          <w:rFonts w:ascii="Arial" w:cs="Arial" w:eastAsia="Arial" w:hAnsi="Arial"/>
+          <w:b/>
+          <w:bCs/>
+          <w:sz w:val="21"/>
+          <w:szCs w:val="21"/>
+        </w:rPr>
+        <w:t xml:space="preserve">Data exploration, cleaning and validation: </w:t>
+      </w:r>
+      <w:r>
+        <w:rPr>
+          <w:rFonts w:ascii="Arial" w:cs="Arial" w:eastAsia="Arial" w:hAnsi="Arial"/>
+          <w:sz w:val="21"/>
+          <w:szCs w:val="21"/>
+        </w:rPr>
+        <w:t xml:space="preserve">about 25 minutes.</w:t>
+      </w:r>
+    </w:p>
+    <w:p>
+      <w:pPr>
+        <w:pStyle w:val="ListParagraph"/>
+        <w:numPr>
+          <w:ilvl w:val="0"/>
+          <w:numId w:val="2"/>
+        </w:numPr>
+        <w:spacing w:after="60"/>
+      </w:pPr>
+      <w:r>
+        <w:rPr>
+          <w:rFonts w:ascii="Arial" w:cs="Arial" w:eastAsia="Arial" w:hAnsi="Arial"/>
+          <w:b/>
+          <w:bCs/>
+          <w:sz w:val="21"/>
+          <w:szCs w:val="21"/>
+        </w:rPr>
+        <w:t xml:space="preserve">Metric definitions, calculations and reconciliation: </w:t>
+      </w:r>
+      <w:r>
+        <w:rPr>
+          <w:rFonts w:ascii="Arial" w:cs="Arial" w:eastAsia="Arial" w:hAnsi="Arial"/>
+          <w:sz w:val="21"/>
+          <w:szCs w:val="21"/>
+        </w:rPr>
+        <w:t xml:space="preserve">about 30 minutes.</w:t>
+      </w:r>
+    </w:p>
+    <w:p>
+      <w:pPr>
+        <w:pStyle w:val="ListParagraph"/>
+        <w:numPr>
+          <w:ilvl w:val="0"/>
+          <w:numId w:val="2"/>
+        </w:numPr>
+        <w:spacing w:after="60"/>
+      </w:pPr>
+      <w:r>
+        <w:rPr>
+          <w:rFonts w:ascii="Arial" w:cs="Arial" w:eastAsia="Arial" w:hAnsi="Arial"/>
+          <w:b/>
+          <w:bCs/>
+          <w:sz w:val="21"/>
+          <w:szCs w:val="21"/>
+        </w:rPr>
+        <w:t xml:space="preserve">Dashboard development and testing: </w:t>
+      </w:r>
+      <w:r>
+        <w:rPr>
+          <w:rFonts w:ascii="Arial" w:cs="Arial" w:eastAsia="Arial" w:hAnsi="Arial"/>
+          <w:sz w:val="21"/>
+          <w:szCs w:val="21"/>
+        </w:rPr>
+        <w:t xml:space="preserve">about 60 minutes.</w:t>
+      </w:r>
+    </w:p>
+    <w:p>
+      <w:pPr>
+        <w:pStyle w:val="ListParagraph"/>
+        <w:numPr>
+          <w:ilvl w:val="0"/>
+          <w:numId w:val="2"/>
+        </w:numPr>
+        <w:spacing w:after="60"/>
+      </w:pPr>
+      <w:r>
+        <w:rPr>
+          <w:rFonts w:ascii="Arial" w:cs="Arial" w:eastAsia="Arial" w:hAnsi="Arial"/>
+          <w:b/>
+          <w:bCs/>
+          <w:sz w:val="21"/>
+          <w:szCs w:val="21"/>
+        </w:rPr>
+        <w:t xml:space="preserve">Write-up, AI appendix and final QA: </w:t>
+      </w:r>
+      <w:r>
+        <w:rPr>
+          <w:rFonts w:ascii="Arial" w:cs="Arial" w:eastAsia="Arial" w:hAnsi="Arial"/>
+          <w:sz w:val="21"/>
+          <w:szCs w:val="21"/>
+        </w:rPr>
+        <w:t xml:space="preserve">about 20 minutes.</w:t>
       </w:r>
     </w:p>
     <w:sectPr>

</xml_diff>

<commit_message>
Label Worth flagging as case-data commentary; warn after upload
</commit_message>
<xml_diff>
--- a/docs/Take-Home_Write-up.docx
+++ b/docs/Take-Home_Write-up.docx
@@ -1156,6 +1156,29 @@
     </w:p>
     <w:p>
       <w:pPr>
+        <w:spacing w:before="80" w:after="100"/>
+      </w:pPr>
+      <w:r>
+        <w:rPr>
+          <w:rFonts w:ascii="Arial" w:cs="Arial" w:eastAsia="Arial" w:hAnsi="Arial"/>
+          <w:b/>
+          <w:bCs/>
+          <w:sz w:val="21"/>
+          <w:szCs w:val="21"/>
+        </w:rPr>
+        <w:t xml:space="preserve">In the app: </w:t>
+      </w:r>
+      <w:r>
+        <w:rPr>
+          <w:rFonts w:ascii="Arial" w:cs="Arial" w:eastAsia="Arial" w:hAnsi="Arial"/>
+          <w:sz w:val="21"/>
+          <w:szCs w:val="21"/>
+        </w:rPr>
+        <w:t xml:space="preserve">these points are on the “Worth flagging (Sept 2026 data)” tab. That tab is commentary on this dataset. Every figure recalculates when a new workbook is uploaded, but the wording is fixed, so the app shows a warning after an upload to re-read the conclusions against the new numbers.</w:t>
+      </w:r>
+    </w:p>
+    <w:p>
+      <w:pPr>
         <w:pStyle w:val="Heading1"/>
         <w:spacing w:after="100" w:before="260"/>
       </w:pPr>

</xml_diff>